<commit_message>
Actualizar lista de KPIS
</commit_message>
<xml_diff>
--- a/DOCUMENTO/1- PROYECTO FINAL.docx
+++ b/DOCUMENTO/1- PROYECTO FINAL.docx
@@ -653,7 +653,7 @@
           <w:r>
             <w:fldChar w:fldCharType="separate"/>
           </w:r>
-          <w:hyperlink w:anchor="_Toc213269738" w:history="1">
+          <w:hyperlink w:anchor="_Toc213481581" w:history="1">
             <w:r>
               <w:rPr>
                 <w:rStyle w:val="Hipervnculo"/>
@@ -680,7 +680,7 @@
                 <w:noProof/>
                 <w:webHidden/>
               </w:rPr>
-              <w:instrText xml:space="preserve"> PAGEREF _Toc213269738 \h </w:instrText>
+              <w:instrText xml:space="preserve"> PAGEREF _Toc213481581 \h </w:instrText>
             </w:r>
             <w:r>
               <w:rPr>
@@ -727,7 +727,7 @@
               <w14:ligatures w14:val="standardContextual"/>
             </w:rPr>
           </w:pPr>
-          <w:hyperlink w:anchor="_Toc213269739" w:history="1">
+          <w:hyperlink w:anchor="_Toc213481582" w:history="1">
             <w:r>
               <w:rPr>
                 <w:rStyle w:val="Hipervnculo"/>
@@ -754,7 +754,7 @@
                 <w:noProof/>
                 <w:webHidden/>
               </w:rPr>
-              <w:instrText xml:space="preserve"> PAGEREF _Toc213269739 \h </w:instrText>
+              <w:instrText xml:space="preserve"> PAGEREF _Toc213481582 \h </w:instrText>
             </w:r>
             <w:r>
               <w:rPr>
@@ -801,7 +801,7 @@
               <w14:ligatures w14:val="standardContextual"/>
             </w:rPr>
           </w:pPr>
-          <w:hyperlink w:anchor="_Toc213269740" w:history="1">
+          <w:hyperlink w:anchor="_Toc213481583" w:history="1">
             <w:r>
               <w:rPr>
                 <w:rStyle w:val="Hipervnculo"/>
@@ -828,7 +828,7 @@
                 <w:noProof/>
                 <w:webHidden/>
               </w:rPr>
-              <w:instrText xml:space="preserve"> PAGEREF _Toc213269740 \h </w:instrText>
+              <w:instrText xml:space="preserve"> PAGEREF _Toc213481583 \h </w:instrText>
             </w:r>
             <w:r>
               <w:rPr>
@@ -875,7 +875,7 @@
               <w14:ligatures w14:val="standardContextual"/>
             </w:rPr>
           </w:pPr>
-          <w:hyperlink w:anchor="_Toc213269741" w:history="1">
+          <w:hyperlink w:anchor="_Toc213481584" w:history="1">
             <w:r>
               <w:rPr>
                 <w:rStyle w:val="Hipervnculo"/>
@@ -902,7 +902,7 @@
                 <w:noProof/>
                 <w:webHidden/>
               </w:rPr>
-              <w:instrText xml:space="preserve"> PAGEREF _Toc213269741 \h </w:instrText>
+              <w:instrText xml:space="preserve"> PAGEREF _Toc213481584 \h </w:instrText>
             </w:r>
             <w:r>
               <w:rPr>
@@ -949,7 +949,7 @@
               <w14:ligatures w14:val="standardContextual"/>
             </w:rPr>
           </w:pPr>
-          <w:hyperlink w:anchor="_Toc213269742" w:history="1">
+          <w:hyperlink w:anchor="_Toc213481585" w:history="1">
             <w:r>
               <w:rPr>
                 <w:rStyle w:val="Hipervnculo"/>
@@ -976,7 +976,7 @@
                 <w:noProof/>
                 <w:webHidden/>
               </w:rPr>
-              <w:instrText xml:space="preserve"> PAGEREF _Toc213269742 \h </w:instrText>
+              <w:instrText xml:space="preserve"> PAGEREF _Toc213481585 \h </w:instrText>
             </w:r>
             <w:r>
               <w:rPr>
@@ -1023,7 +1023,7 @@
               <w14:ligatures w14:val="standardContextual"/>
             </w:rPr>
           </w:pPr>
-          <w:hyperlink w:anchor="_Toc213269743" w:history="1">
+          <w:hyperlink w:anchor="_Toc213481586" w:history="1">
             <w:r>
               <w:rPr>
                 <w:rStyle w:val="Hipervnculo"/>
@@ -1050,7 +1050,7 @@
                 <w:noProof/>
                 <w:webHidden/>
               </w:rPr>
-              <w:instrText xml:space="preserve"> PAGEREF _Toc213269743 \h </w:instrText>
+              <w:instrText xml:space="preserve"> PAGEREF _Toc213481586 \h </w:instrText>
             </w:r>
             <w:r>
               <w:rPr>
@@ -1097,7 +1097,7 @@
               <w14:ligatures w14:val="standardContextual"/>
             </w:rPr>
           </w:pPr>
-          <w:hyperlink w:anchor="_Toc213269744" w:history="1">
+          <w:hyperlink w:anchor="_Toc213481587" w:history="1">
             <w:r>
               <w:rPr>
                 <w:rStyle w:val="Hipervnculo"/>
@@ -1124,7 +1124,7 @@
                 <w:noProof/>
                 <w:webHidden/>
               </w:rPr>
-              <w:instrText xml:space="preserve"> PAGEREF _Toc213269744 \h </w:instrText>
+              <w:instrText xml:space="preserve"> PAGEREF _Toc213481587 \h </w:instrText>
             </w:r>
             <w:r>
               <w:rPr>
@@ -1171,7 +1171,7 @@
               <w14:ligatures w14:val="standardContextual"/>
             </w:rPr>
           </w:pPr>
-          <w:hyperlink w:anchor="_Toc213269745" w:history="1">
+          <w:hyperlink w:anchor="_Toc213481588" w:history="1">
             <w:r>
               <w:rPr>
                 <w:rStyle w:val="Hipervnculo"/>
@@ -1198,7 +1198,7 @@
                 <w:noProof/>
                 <w:webHidden/>
               </w:rPr>
-              <w:instrText xml:space="preserve"> PAGEREF _Toc213269745 \h </w:instrText>
+              <w:instrText xml:space="preserve"> PAGEREF _Toc213481588 \h </w:instrText>
             </w:r>
             <w:r>
               <w:rPr>
@@ -1245,7 +1245,7 @@
               <w14:ligatures w14:val="standardContextual"/>
             </w:rPr>
           </w:pPr>
-          <w:hyperlink w:anchor="_Toc213269746" w:history="1">
+          <w:hyperlink w:anchor="_Toc213481589" w:history="1">
             <w:r>
               <w:rPr>
                 <w:rStyle w:val="Hipervnculo"/>
@@ -1272,7 +1272,7 @@
                 <w:noProof/>
                 <w:webHidden/>
               </w:rPr>
-              <w:instrText xml:space="preserve"> PAGEREF _Toc213269746 \h </w:instrText>
+              <w:instrText xml:space="preserve"> PAGEREF _Toc213481589 \h </w:instrText>
             </w:r>
             <w:r>
               <w:rPr>
@@ -1319,7 +1319,7 @@
               <w14:ligatures w14:val="standardContextual"/>
             </w:rPr>
           </w:pPr>
-          <w:hyperlink w:anchor="_Toc213269747" w:history="1">
+          <w:hyperlink w:anchor="_Toc213481590" w:history="1">
             <w:r>
               <w:rPr>
                 <w:rStyle w:val="Hipervnculo"/>
@@ -1346,7 +1346,7 @@
                 <w:noProof/>
                 <w:webHidden/>
               </w:rPr>
-              <w:instrText xml:space="preserve"> PAGEREF _Toc213269747 \h </w:instrText>
+              <w:instrText xml:space="preserve"> PAGEREF _Toc213481590 \h </w:instrText>
             </w:r>
             <w:r>
               <w:rPr>
@@ -1393,7 +1393,7 @@
               <w14:ligatures w14:val="standardContextual"/>
             </w:rPr>
           </w:pPr>
-          <w:hyperlink w:anchor="_Toc213269748" w:history="1">
+          <w:hyperlink w:anchor="_Toc213481591" w:history="1">
             <w:r>
               <w:rPr>
                 <w:rStyle w:val="Hipervnculo"/>
@@ -1420,7 +1420,7 @@
                 <w:noProof/>
                 <w:webHidden/>
               </w:rPr>
-              <w:instrText xml:space="preserve"> PAGEREF _Toc213269748 \h </w:instrText>
+              <w:instrText xml:space="preserve"> PAGEREF _Toc213481591 \h </w:instrText>
             </w:r>
             <w:r>
               <w:rPr>
@@ -1467,7 +1467,7 @@
               <w14:ligatures w14:val="standardContextual"/>
             </w:rPr>
           </w:pPr>
-          <w:hyperlink w:anchor="_Toc213269749" w:history="1">
+          <w:hyperlink w:anchor="_Toc213481592" w:history="1">
             <w:r>
               <w:rPr>
                 <w:rStyle w:val="Hipervnculo"/>
@@ -1494,7 +1494,7 @@
                 <w:noProof/>
                 <w:webHidden/>
               </w:rPr>
-              <w:instrText xml:space="preserve"> PAGEREF _Toc213269749 \h </w:instrText>
+              <w:instrText xml:space="preserve"> PAGEREF _Toc213481592 \h </w:instrText>
             </w:r>
             <w:r>
               <w:rPr>
@@ -1638,7 +1638,7 @@
       <w:pPr>
         <w:pStyle w:val="Ttulo1"/>
       </w:pPr>
-      <w:bookmarkStart w:id="0" w:name="_Toc213269738"/>
+      <w:bookmarkStart w:id="0" w:name="_Toc213481581"/>
       <w:r>
         <w:lastRenderedPageBreak/>
         <w:t>Introducción</w:t>
@@ -1690,7 +1690,7 @@
       <w:pPr>
         <w:pStyle w:val="Ttulo1"/>
       </w:pPr>
-      <w:bookmarkStart w:id="1" w:name="_Toc213269739"/>
+      <w:bookmarkStart w:id="1" w:name="_Toc213481582"/>
       <w:r>
         <w:t>Planteamiento del Problema</w:t>
       </w:r>
@@ -1720,7 +1720,7 @@
       <w:pPr>
         <w:pStyle w:val="Ttulo1"/>
       </w:pPr>
-      <w:bookmarkStart w:id="2" w:name="_Toc213269740"/>
+      <w:bookmarkStart w:id="2" w:name="_Toc213481583"/>
       <w:r>
         <w:lastRenderedPageBreak/>
         <w:t>Justificación</w:t>
@@ -1775,7 +1775,7 @@
       <w:pPr>
         <w:pStyle w:val="Ttulo1"/>
       </w:pPr>
-      <w:bookmarkStart w:id="3" w:name="_Toc213269741"/>
+      <w:bookmarkStart w:id="3" w:name="_Toc213481584"/>
       <w:r>
         <w:t>Objetivos General:</w:t>
       </w:r>
@@ -1828,7 +1828,7 @@
       <w:pPr>
         <w:pStyle w:val="Ttulo1"/>
       </w:pPr>
-      <w:bookmarkStart w:id="4" w:name="_Toc213269742"/>
+      <w:bookmarkStart w:id="4" w:name="_Toc213481585"/>
       <w:r>
         <w:t>Específicos:</w:t>
       </w:r>
@@ -1961,7 +1961,7 @@
       <w:pPr>
         <w:pStyle w:val="Ttulo1"/>
       </w:pPr>
-      <w:bookmarkStart w:id="5" w:name="_Toc213269743"/>
+      <w:bookmarkStart w:id="5" w:name="_Toc213481586"/>
       <w:r>
         <w:t>Metodología de BI</w:t>
       </w:r>
@@ -2050,7 +2050,7 @@
       <w:pPr>
         <w:pStyle w:val="Ttulo1"/>
       </w:pPr>
-      <w:bookmarkStart w:id="6" w:name="_Toc213269744"/>
+      <w:bookmarkStart w:id="6" w:name="_Toc213481587"/>
       <w:r>
         <w:lastRenderedPageBreak/>
         <w:t>Análisis del Modelo Fuente (OLTP)</w:t>
@@ -2151,7 +2151,7 @@
       <w:pPr>
         <w:pStyle w:val="Ttulo1"/>
       </w:pPr>
-      <w:bookmarkStart w:id="7" w:name="_Toc213269745"/>
+      <w:bookmarkStart w:id="7" w:name="_Toc213481588"/>
       <w:r>
         <w:lastRenderedPageBreak/>
         <w:t xml:space="preserve">Diseño del Data </w:t>
@@ -2340,7 +2340,7 @@
       <w:pPr>
         <w:pStyle w:val="Ttulo1"/>
       </w:pPr>
-      <w:bookmarkStart w:id="8" w:name="_Toc213269746"/>
+      <w:bookmarkStart w:id="8" w:name="_Toc213481589"/>
       <w:r>
         <w:lastRenderedPageBreak/>
         <w:t>Proceso ETL (Extracción, Transformación y Carga)</w:t>
@@ -2381,7 +2381,7 @@
       <w:pPr>
         <w:pStyle w:val="Ttulo1"/>
       </w:pPr>
-      <w:bookmarkStart w:id="9" w:name="_Toc213269747"/>
+      <w:bookmarkStart w:id="9" w:name="_Toc213481590"/>
       <w:r>
         <w:t>Pila Tecnológica (</w:t>
       </w:r>
@@ -2543,7 +2543,7 @@
       <w:pPr>
         <w:pStyle w:val="Ttulo1"/>
       </w:pPr>
-      <w:bookmarkStart w:id="10" w:name="_Toc213269748"/>
+      <w:bookmarkStart w:id="10" w:name="_Toc213481591"/>
       <w:r>
         <w:t xml:space="preserve">Definición de </w:t>
       </w:r>
@@ -2591,13 +2591,28 @@
         </w:pBdr>
         <w:jc w:val="both"/>
       </w:pPr>
+      <w:r>
+        <w:t>Pacientes Atendidos</w:t>
+      </w:r>
+    </w:p>
+    <w:p>
+      <w:pPr>
+        <w:pBdr>
+          <w:top w:val="nil"/>
+          <w:left w:val="nil"/>
+          <w:bottom w:val="nil"/>
+          <w:right w:val="nil"/>
+          <w:between w:val="nil"/>
+        </w:pBdr>
+        <w:jc w:val="both"/>
+      </w:pPr>
     </w:p>
     <w:p>
       <w:pPr>
         <w:pStyle w:val="Prrafodelista"/>
         <w:numPr>
           <w:ilvl w:val="0"/>
-          <w:numId w:val="10"/>
+          <w:numId w:val="11"/>
         </w:numPr>
         <w:pBdr>
           <w:top w:val="nil"/>
@@ -2606,11 +2621,10 @@
           <w:right w:val="nil"/>
           <w:between w:val="nil"/>
         </w:pBdr>
-        <w:spacing w:line="360" w:lineRule="auto"/>
         <w:jc w:val="both"/>
       </w:pPr>
       <w:r>
-        <w:t xml:space="preserve">Frecuencia de visitas por paciente. </w:t>
+        <w:t>Ingresos Totales</w:t>
       </w:r>
     </w:p>
     <w:p>
@@ -2618,7 +2632,7 @@
         <w:pStyle w:val="Prrafodelista"/>
         <w:numPr>
           <w:ilvl w:val="0"/>
-          <w:numId w:val="10"/>
+          <w:numId w:val="11"/>
         </w:numPr>
         <w:pBdr>
           <w:top w:val="nil"/>
@@ -2627,11 +2641,16 @@
           <w:right w:val="nil"/>
           <w:between w:val="nil"/>
         </w:pBdr>
-        <w:spacing w:line="360" w:lineRule="auto"/>
         <w:jc w:val="both"/>
       </w:pPr>
       <w:r>
-        <w:t xml:space="preserve">Costo promedio por unidad médica. </w:t>
+        <w:t xml:space="preserve">Atenciones </w:t>
+      </w:r>
+      <w:r>
+        <w:t>médicas</w:t>
+      </w:r>
+      <w:r>
+        <w:t xml:space="preserve"> por mes</w:t>
       </w:r>
     </w:p>
     <w:p>
@@ -2639,7 +2658,7 @@
         <w:pStyle w:val="Prrafodelista"/>
         <w:numPr>
           <w:ilvl w:val="0"/>
-          <w:numId w:val="10"/>
+          <w:numId w:val="11"/>
         </w:numPr>
         <w:pBdr>
           <w:top w:val="nil"/>
@@ -2648,19 +2667,10 @@
           <w:right w:val="nil"/>
           <w:between w:val="nil"/>
         </w:pBdr>
-        <w:spacing w:line="360" w:lineRule="auto"/>
         <w:jc w:val="both"/>
       </w:pPr>
       <w:r>
-        <w:t xml:space="preserve">Rendimiento de médicos (atenciones totales / </w:t>
-      </w:r>
-      <w:proofErr w:type="gramStart"/>
-      <w:r>
-        <w:t>ticket</w:t>
-      </w:r>
-      <w:proofErr w:type="gramEnd"/>
-      <w:r>
-        <w:t xml:space="preserve"> promedio). </w:t>
+        <w:t>Top 10 diagnostico</w:t>
       </w:r>
     </w:p>
     <w:p>
@@ -2668,7 +2678,7 @@
         <w:pStyle w:val="Prrafodelista"/>
         <w:numPr>
           <w:ilvl w:val="0"/>
-          <w:numId w:val="10"/>
+          <w:numId w:val="11"/>
         </w:numPr>
         <w:pBdr>
           <w:top w:val="nil"/>
@@ -2677,11 +2687,10 @@
           <w:right w:val="nil"/>
           <w:between w:val="nil"/>
         </w:pBdr>
-        <w:spacing w:line="360" w:lineRule="auto"/>
         <w:jc w:val="both"/>
       </w:pPr>
       <w:r>
-        <w:t xml:space="preserve">Porcentaje de cobertura de seguros médicos. Tiempo promedio por atención. </w:t>
+        <w:t>Tipos de urgencias atendidas</w:t>
       </w:r>
     </w:p>
     <w:p>
@@ -2689,7 +2698,7 @@
         <w:pStyle w:val="Prrafodelista"/>
         <w:numPr>
           <w:ilvl w:val="0"/>
-          <w:numId w:val="10"/>
+          <w:numId w:val="11"/>
         </w:numPr>
         <w:pBdr>
           <w:top w:val="nil"/>
@@ -2698,15 +2707,25 @@
           <w:right w:val="nil"/>
           <w:between w:val="nil"/>
         </w:pBdr>
-        <w:spacing w:line="360" w:lineRule="auto"/>
         <w:jc w:val="both"/>
       </w:pPr>
       <w:r>
-        <w:t xml:space="preserve">Pacientes recurrentes mensualmente. </w:t>
-      </w:r>
-    </w:p>
-    <w:p>
-      <w:pPr>
+        <w:t xml:space="preserve">Atenciones </w:t>
+      </w:r>
+      <w:r>
+        <w:t>médicas</w:t>
+      </w:r>
+      <w:r>
+        <w:t xml:space="preserve"> por sexo</w:t>
+      </w:r>
+    </w:p>
+    <w:p>
+      <w:pPr>
+        <w:pStyle w:val="Prrafodelista"/>
+        <w:numPr>
+          <w:ilvl w:val="0"/>
+          <w:numId w:val="11"/>
+        </w:numPr>
         <w:pBdr>
           <w:top w:val="nil"/>
           <w:left w:val="nil"/>
@@ -2716,9 +2735,17 @@
         </w:pBdr>
         <w:jc w:val="both"/>
       </w:pPr>
-    </w:p>
-    <w:p>
-      <w:pPr>
+      <w:r>
+        <w:t xml:space="preserve">Servicio por especialidad </w:t>
+      </w:r>
+    </w:p>
+    <w:p>
+      <w:pPr>
+        <w:pStyle w:val="Prrafodelista"/>
+        <w:numPr>
+          <w:ilvl w:val="0"/>
+          <w:numId w:val="11"/>
+        </w:numPr>
         <w:pBdr>
           <w:top w:val="nil"/>
           <w:left w:val="nil"/>
@@ -2729,35 +2756,16 @@
         <w:jc w:val="both"/>
       </w:pPr>
       <w:r>
-        <w:t xml:space="preserve">Estos </w:t>
-      </w:r>
-      <w:proofErr w:type="spellStart"/>
-      <w:r>
-        <w:t>KPIs</w:t>
-      </w:r>
-      <w:proofErr w:type="spellEnd"/>
-      <w:r>
-        <w:t xml:space="preserve"> permiten evaluar la eficiencia operativa y la sostenibilidad financiera de la red clínica.</w:t>
-      </w:r>
-    </w:p>
-    <w:p>
-      <w:r>
-        <w:br w:type="page"/>
-      </w:r>
-    </w:p>
-    <w:p>
-      <w:pPr>
-        <w:pStyle w:val="Ttulo1"/>
-      </w:pPr>
-      <w:bookmarkStart w:id="11" w:name="_Toc213269749"/>
-      <w:r>
-        <w:lastRenderedPageBreak/>
-        <w:t>IMPLEMENTACIÓN Y RESULTADOS (DASHBOARD)</w:t>
-      </w:r>
-      <w:bookmarkEnd w:id="11"/>
-    </w:p>
-    <w:p>
-      <w:pPr>
+        <w:t xml:space="preserve">Cantidad de atenciones por tipo de urgencia </w:t>
+      </w:r>
+    </w:p>
+    <w:p>
+      <w:pPr>
+        <w:pStyle w:val="Prrafodelista"/>
+        <w:numPr>
+          <w:ilvl w:val="0"/>
+          <w:numId w:val="11"/>
+        </w:numPr>
         <w:pBdr>
           <w:top w:val="nil"/>
           <w:left w:val="nil"/>
@@ -2768,21 +2776,16 @@
         <w:jc w:val="both"/>
       </w:pPr>
       <w:r>
-        <w:t xml:space="preserve">El sistema de inteligencia de negocios consolidó exitosamente los datos desde múltiples fuentes en un modelo OLAP unificado. La implementación del ETL permitió obtener un repositorio confiable de información, con un seguimiento detallado de las atenciones, costos, coberturas y desempeño médico. Las consultas analíticas ejecutadas sobre el Data </w:t>
-      </w:r>
-      <w:proofErr w:type="spellStart"/>
-      <w:proofErr w:type="gramStart"/>
-      <w:r>
-        <w:t>Mart</w:t>
-      </w:r>
-      <w:proofErr w:type="spellEnd"/>
-      <w:proofErr w:type="gramEnd"/>
-      <w:r>
-        <w:t xml:space="preserve"> demostraron una mejora significativa en los tiempos de respuesta respecto a las consultas realizadas sobre el modelo transaccional.</w:t>
-      </w:r>
-    </w:p>
-    <w:p>
-      <w:pPr>
+        <w:t xml:space="preserve">Top 10 Pacientes que visitan </w:t>
+      </w:r>
+    </w:p>
+    <w:p>
+      <w:pPr>
+        <w:pStyle w:val="Prrafodelista"/>
+        <w:numPr>
+          <w:ilvl w:val="0"/>
+          <w:numId w:val="11"/>
+        </w:numPr>
         <w:pBdr>
           <w:top w:val="nil"/>
           <w:left w:val="nil"/>
@@ -2793,11 +2796,329 @@
         <w:jc w:val="both"/>
       </w:pPr>
       <w:r>
+        <w:t xml:space="preserve">top 10 por unidad medica </w:t>
+      </w:r>
+    </w:p>
+    <w:p>
+      <w:pPr>
+        <w:pStyle w:val="Prrafodelista"/>
+        <w:numPr>
+          <w:ilvl w:val="0"/>
+          <w:numId w:val="11"/>
+        </w:numPr>
+        <w:pBdr>
+          <w:top w:val="nil"/>
+          <w:left w:val="nil"/>
+          <w:bottom w:val="nil"/>
+          <w:right w:val="nil"/>
+          <w:between w:val="nil"/>
+        </w:pBdr>
+        <w:jc w:val="both"/>
+      </w:pPr>
+      <w:r>
+        <w:t xml:space="preserve">Productividad por médico  </w:t>
+      </w:r>
+    </w:p>
+    <w:p>
+      <w:pPr>
+        <w:pStyle w:val="Prrafodelista"/>
+        <w:numPr>
+          <w:ilvl w:val="0"/>
+          <w:numId w:val="11"/>
+        </w:numPr>
+        <w:pBdr>
+          <w:top w:val="nil"/>
+          <w:left w:val="nil"/>
+          <w:bottom w:val="nil"/>
+          <w:right w:val="nil"/>
+          <w:between w:val="nil"/>
+        </w:pBdr>
+        <w:jc w:val="both"/>
+      </w:pPr>
+      <w:r>
+        <w:t>ingresos medio por paciente</w:t>
+      </w:r>
+    </w:p>
+    <w:p>
+      <w:pPr>
+        <w:pStyle w:val="Prrafodelista"/>
+        <w:numPr>
+          <w:ilvl w:val="0"/>
+          <w:numId w:val="11"/>
+        </w:numPr>
+        <w:pBdr>
+          <w:top w:val="nil"/>
+          <w:left w:val="nil"/>
+          <w:bottom w:val="nil"/>
+          <w:right w:val="nil"/>
+          <w:between w:val="nil"/>
+        </w:pBdr>
+        <w:jc w:val="both"/>
+      </w:pPr>
+      <w:r>
+        <w:t>Costo medio por paciente</w:t>
+      </w:r>
+    </w:p>
+    <w:p>
+      <w:pPr>
+        <w:pStyle w:val="Prrafodelista"/>
+        <w:numPr>
+          <w:ilvl w:val="0"/>
+          <w:numId w:val="11"/>
+        </w:numPr>
+        <w:pBdr>
+          <w:top w:val="nil"/>
+          <w:left w:val="nil"/>
+          <w:bottom w:val="nil"/>
+          <w:right w:val="nil"/>
+          <w:between w:val="nil"/>
+        </w:pBdr>
+        <w:jc w:val="both"/>
+      </w:pPr>
+      <w:r>
+        <w:t>Atenciones por rango de ingreso</w:t>
+      </w:r>
+    </w:p>
+    <w:p>
+      <w:pPr>
+        <w:pStyle w:val="Prrafodelista"/>
+        <w:numPr>
+          <w:ilvl w:val="0"/>
+          <w:numId w:val="11"/>
+        </w:numPr>
+        <w:pBdr>
+          <w:top w:val="nil"/>
+          <w:left w:val="nil"/>
+          <w:bottom w:val="nil"/>
+          <w:right w:val="nil"/>
+          <w:between w:val="nil"/>
+        </w:pBdr>
+        <w:jc w:val="both"/>
+      </w:pPr>
+      <w:r>
+        <w:t>Atenciones por tipo de servicio</w:t>
+      </w:r>
+    </w:p>
+    <w:p>
+      <w:pPr>
+        <w:pStyle w:val="Prrafodelista"/>
+        <w:numPr>
+          <w:ilvl w:val="0"/>
+          <w:numId w:val="11"/>
+        </w:numPr>
+        <w:pBdr>
+          <w:top w:val="nil"/>
+          <w:left w:val="nil"/>
+          <w:bottom w:val="nil"/>
+          <w:right w:val="nil"/>
+          <w:between w:val="nil"/>
+        </w:pBdr>
+        <w:jc w:val="both"/>
+      </w:pPr>
+      <w:r>
+        <w:t xml:space="preserve">Distribución por insumos médicos </w:t>
+      </w:r>
+    </w:p>
+    <w:p>
+      <w:pPr>
+        <w:pStyle w:val="Prrafodelista"/>
+        <w:numPr>
+          <w:ilvl w:val="0"/>
+          <w:numId w:val="11"/>
+        </w:numPr>
+        <w:pBdr>
+          <w:top w:val="nil"/>
+          <w:left w:val="nil"/>
+          <w:bottom w:val="nil"/>
+          <w:right w:val="nil"/>
+          <w:between w:val="nil"/>
+        </w:pBdr>
+        <w:jc w:val="both"/>
+      </w:pPr>
+      <w:r>
+        <w:t xml:space="preserve">Costo medio insumos médicos </w:t>
+      </w:r>
+    </w:p>
+    <w:p>
+      <w:pPr>
+        <w:pStyle w:val="Prrafodelista"/>
+        <w:numPr>
+          <w:ilvl w:val="0"/>
+          <w:numId w:val="11"/>
+        </w:numPr>
+        <w:pBdr>
+          <w:top w:val="nil"/>
+          <w:left w:val="nil"/>
+          <w:bottom w:val="nil"/>
+          <w:right w:val="nil"/>
+          <w:between w:val="nil"/>
+        </w:pBdr>
+        <w:jc w:val="both"/>
+      </w:pPr>
+      <w:r>
+        <w:t xml:space="preserve">Ingreso de seguro vs ingreso total </w:t>
+      </w:r>
+    </w:p>
+    <w:p>
+      <w:pPr>
+        <w:pStyle w:val="Prrafodelista"/>
+        <w:numPr>
+          <w:ilvl w:val="0"/>
+          <w:numId w:val="11"/>
+        </w:numPr>
+        <w:pBdr>
+          <w:top w:val="nil"/>
+          <w:left w:val="nil"/>
+          <w:bottom w:val="nil"/>
+          <w:right w:val="nil"/>
+          <w:between w:val="nil"/>
+        </w:pBdr>
+        <w:jc w:val="both"/>
+      </w:pPr>
+      <w:r>
+        <w:t>C</w:t>
+      </w:r>
+      <w:r>
+        <w:t>osto</w:t>
+      </w:r>
+      <w:r>
+        <w:t xml:space="preserve"> de </w:t>
+      </w:r>
+      <w:r>
+        <w:t xml:space="preserve">insumos por mes </w:t>
+      </w:r>
+    </w:p>
+    <w:p>
+      <w:pPr>
+        <w:pStyle w:val="Prrafodelista"/>
+        <w:numPr>
+          <w:ilvl w:val="0"/>
+          <w:numId w:val="11"/>
+        </w:numPr>
+        <w:pBdr>
+          <w:top w:val="nil"/>
+          <w:left w:val="nil"/>
+          <w:bottom w:val="nil"/>
+          <w:right w:val="nil"/>
+          <w:between w:val="nil"/>
+        </w:pBdr>
+        <w:jc w:val="both"/>
+      </w:pPr>
+      <w:r>
+        <w:t xml:space="preserve">Ingresos y costos por Departamento </w:t>
+      </w:r>
+    </w:p>
+    <w:p>
+      <w:pPr>
+        <w:pStyle w:val="Prrafodelista"/>
+        <w:numPr>
+          <w:ilvl w:val="0"/>
+          <w:numId w:val="11"/>
+        </w:numPr>
+        <w:pBdr>
+          <w:top w:val="nil"/>
+          <w:left w:val="nil"/>
+          <w:bottom w:val="nil"/>
+          <w:right w:val="nil"/>
+          <w:between w:val="nil"/>
+        </w:pBdr>
+        <w:jc w:val="both"/>
+      </w:pPr>
+      <w:r>
+        <w:t>Ingreso y costos por unidad medica</w:t>
+      </w:r>
+    </w:p>
+    <w:p>
+      <w:pPr>
+        <w:pBdr>
+          <w:top w:val="nil"/>
+          <w:left w:val="nil"/>
+          <w:bottom w:val="nil"/>
+          <w:right w:val="nil"/>
+          <w:between w:val="nil"/>
+        </w:pBdr>
+        <w:jc w:val="both"/>
+      </w:pPr>
+    </w:p>
+    <w:p>
+      <w:pPr>
+        <w:pBdr>
+          <w:top w:val="nil"/>
+          <w:left w:val="nil"/>
+          <w:bottom w:val="nil"/>
+          <w:right w:val="nil"/>
+          <w:between w:val="nil"/>
+        </w:pBdr>
+        <w:jc w:val="both"/>
+      </w:pPr>
+      <w:r>
+        <w:t xml:space="preserve">Estos </w:t>
+      </w:r>
+      <w:proofErr w:type="spellStart"/>
+      <w:r>
+        <w:t>KPIs</w:t>
+      </w:r>
+      <w:proofErr w:type="spellEnd"/>
+      <w:r>
+        <w:t xml:space="preserve"> permiten evaluar la eficiencia operativa y la sostenibilidad financiera de la red clínica</w:t>
+      </w:r>
+      <w:r>
+        <w:t>.</w:t>
+      </w:r>
+    </w:p>
+    <w:p>
+      <w:pPr>
+        <w:pStyle w:val="Ttulo1"/>
+      </w:pPr>
+      <w:bookmarkStart w:id="11" w:name="_Toc213481592"/>
+      <w:r>
+        <w:lastRenderedPageBreak/>
+        <w:t>IMPLEMENTACIÓN Y RESULTADOS (DASHBOARD)</w:t>
+      </w:r>
+      <w:bookmarkEnd w:id="11"/>
+    </w:p>
+    <w:p>
+      <w:pPr>
+        <w:pBdr>
+          <w:top w:val="nil"/>
+          <w:left w:val="nil"/>
+          <w:bottom w:val="nil"/>
+          <w:right w:val="nil"/>
+          <w:between w:val="nil"/>
+        </w:pBdr>
+        <w:jc w:val="both"/>
+      </w:pPr>
+      <w:r>
+        <w:t xml:space="preserve">El sistema de inteligencia de negocios consolidó exitosamente los datos desde múltiples fuentes en un modelo OLAP unificado. La implementación del ETL permitió obtener un repositorio confiable de información, con un seguimiento detallado de las atenciones, costos, coberturas y desempeño médico. Las consultas analíticas ejecutadas sobre el Data </w:t>
+      </w:r>
+      <w:proofErr w:type="spellStart"/>
+      <w:proofErr w:type="gramStart"/>
+      <w:r>
+        <w:t>Mart</w:t>
+      </w:r>
+      <w:proofErr w:type="spellEnd"/>
+      <w:proofErr w:type="gramEnd"/>
+      <w:r>
+        <w:t xml:space="preserve"> demostraron una mejora significativa en los tiempos de respuesta respecto a las consultas realizadas sobre el modelo transaccional.</w:t>
+      </w:r>
+    </w:p>
+    <w:p>
+      <w:pPr>
+        <w:pBdr>
+          <w:top w:val="nil"/>
+          <w:left w:val="nil"/>
+          <w:bottom w:val="nil"/>
+          <w:right w:val="nil"/>
+          <w:between w:val="nil"/>
+        </w:pBdr>
+        <w:jc w:val="both"/>
+      </w:pPr>
+      <w:r>
         <w:rPr>
           <w:noProof/>
         </w:rPr>
         <w:drawing>
-          <wp:anchor distT="0" distB="0" distL="114300" distR="114300" simplePos="0" relativeHeight="251663360" behindDoc="0" locked="0" layoutInCell="1" allowOverlap="1" wp14:anchorId="79B242A2" wp14:editId="3519EDEB">
+          <wp:anchor distT="0" distB="0" distL="114300" distR="114300" simplePos="0" relativeHeight="251663360" behindDoc="0" locked="0" layoutInCell="1" allowOverlap="1" wp14:anchorId="79B242A2" wp14:editId="03FE9AD8">
             <wp:simplePos x="0" y="0"/>
             <wp:positionH relativeFrom="margin">
               <wp:align>left</wp:align>
@@ -2858,7 +3179,7 @@
           <w:noProof/>
         </w:rPr>
         <w:drawing>
-          <wp:anchor distT="0" distB="0" distL="114300" distR="114300" simplePos="0" relativeHeight="251662336" behindDoc="0" locked="0" layoutInCell="1" allowOverlap="1" wp14:anchorId="2EE13F2D" wp14:editId="565C7C50">
+          <wp:anchor distT="0" distB="0" distL="114300" distR="114300" simplePos="0" relativeHeight="251662336" behindDoc="0" locked="0" layoutInCell="1" allowOverlap="1" wp14:anchorId="2EE13F2D" wp14:editId="34282ACC">
             <wp:simplePos x="0" y="0"/>
             <wp:positionH relativeFrom="margin">
               <wp:align>left</wp:align>
@@ -2925,7 +3246,7 @@
         </w:rPr>
         <w:lastRenderedPageBreak/>
         <w:drawing>
-          <wp:anchor distT="0" distB="0" distL="114300" distR="114300" simplePos="0" relativeHeight="251664384" behindDoc="0" locked="0" layoutInCell="1" allowOverlap="1" wp14:anchorId="7C677ECA" wp14:editId="33C2E1C8">
+          <wp:anchor distT="0" distB="0" distL="114300" distR="114300" simplePos="0" relativeHeight="251664384" behindDoc="0" locked="0" layoutInCell="1" allowOverlap="1" wp14:anchorId="7C677ECA" wp14:editId="2471932F">
             <wp:simplePos x="0" y="0"/>
             <wp:positionH relativeFrom="margin">
               <wp:posOffset>-63062</wp:posOffset>
@@ -2989,7 +3310,7 @@
           <w:noProof/>
         </w:rPr>
         <w:drawing>
-          <wp:anchor distT="0" distB="0" distL="114300" distR="114300" simplePos="0" relativeHeight="251665408" behindDoc="0" locked="0" layoutInCell="1" allowOverlap="1" wp14:anchorId="709C97A3" wp14:editId="71786B8D">
+          <wp:anchor distT="0" distB="0" distL="114300" distR="114300" simplePos="0" relativeHeight="251665408" behindDoc="0" locked="0" layoutInCell="1" allowOverlap="1" wp14:anchorId="709C97A3" wp14:editId="7F06016C">
             <wp:simplePos x="0" y="0"/>
             <wp:positionH relativeFrom="margin">
               <wp:align>left</wp:align>
@@ -3832,6 +4153,92 @@
     </w:lvl>
   </w:abstractNum>
   <w:abstractNum w:abstractNumId="4" w15:restartNumberingAfterBreak="0">
+    <w:nsid w:val="37EA5C24"/>
+    <w:multiLevelType w:val="hybridMultilevel"/>
+    <w:tmpl w:val="4BE029E4"/>
+    <w:lvl w:ilvl="0" w:tplc="440A000F">
+      <w:start w:val="1"/>
+      <w:numFmt w:val="decimal"/>
+      <w:lvlText w:val="%1."/>
+      <w:lvlJc w:val="left"/>
+      <w:pPr>
+        <w:ind w:left="720" w:hanging="360"/>
+      </w:pPr>
+    </w:lvl>
+    <w:lvl w:ilvl="1" w:tplc="440A0019" w:tentative="1">
+      <w:start w:val="1"/>
+      <w:numFmt w:val="lowerLetter"/>
+      <w:lvlText w:val="%2."/>
+      <w:lvlJc w:val="left"/>
+      <w:pPr>
+        <w:ind w:left="1440" w:hanging="360"/>
+      </w:pPr>
+    </w:lvl>
+    <w:lvl w:ilvl="2" w:tplc="440A001B" w:tentative="1">
+      <w:start w:val="1"/>
+      <w:numFmt w:val="lowerRoman"/>
+      <w:lvlText w:val="%3."/>
+      <w:lvlJc w:val="right"/>
+      <w:pPr>
+        <w:ind w:left="2160" w:hanging="180"/>
+      </w:pPr>
+    </w:lvl>
+    <w:lvl w:ilvl="3" w:tplc="440A000F" w:tentative="1">
+      <w:start w:val="1"/>
+      <w:numFmt w:val="decimal"/>
+      <w:lvlText w:val="%4."/>
+      <w:lvlJc w:val="left"/>
+      <w:pPr>
+        <w:ind w:left="2880" w:hanging="360"/>
+      </w:pPr>
+    </w:lvl>
+    <w:lvl w:ilvl="4" w:tplc="440A0019" w:tentative="1">
+      <w:start w:val="1"/>
+      <w:numFmt w:val="lowerLetter"/>
+      <w:lvlText w:val="%5."/>
+      <w:lvlJc w:val="left"/>
+      <w:pPr>
+        <w:ind w:left="3600" w:hanging="360"/>
+      </w:pPr>
+    </w:lvl>
+    <w:lvl w:ilvl="5" w:tplc="440A001B" w:tentative="1">
+      <w:start w:val="1"/>
+      <w:numFmt w:val="lowerRoman"/>
+      <w:lvlText w:val="%6."/>
+      <w:lvlJc w:val="right"/>
+      <w:pPr>
+        <w:ind w:left="4320" w:hanging="180"/>
+      </w:pPr>
+    </w:lvl>
+    <w:lvl w:ilvl="6" w:tplc="440A000F" w:tentative="1">
+      <w:start w:val="1"/>
+      <w:numFmt w:val="decimal"/>
+      <w:lvlText w:val="%7."/>
+      <w:lvlJc w:val="left"/>
+      <w:pPr>
+        <w:ind w:left="5040" w:hanging="360"/>
+      </w:pPr>
+    </w:lvl>
+    <w:lvl w:ilvl="7" w:tplc="440A0019" w:tentative="1">
+      <w:start w:val="1"/>
+      <w:numFmt w:val="lowerLetter"/>
+      <w:lvlText w:val="%8."/>
+      <w:lvlJc w:val="left"/>
+      <w:pPr>
+        <w:ind w:left="5760" w:hanging="360"/>
+      </w:pPr>
+    </w:lvl>
+    <w:lvl w:ilvl="8" w:tplc="440A001B" w:tentative="1">
+      <w:start w:val="1"/>
+      <w:numFmt w:val="lowerRoman"/>
+      <w:lvlText w:val="%9."/>
+      <w:lvlJc w:val="right"/>
+      <w:pPr>
+        <w:ind w:left="6480" w:hanging="180"/>
+      </w:pPr>
+    </w:lvl>
+  </w:abstractNum>
+  <w:abstractNum w:abstractNumId="5" w15:restartNumberingAfterBreak="0">
     <w:nsid w:val="483E2FD4"/>
     <w:multiLevelType w:val="hybridMultilevel"/>
     <w:tmpl w:val="4C84BB2C"/>
@@ -3917,7 +4324,7 @@
       </w:pPr>
     </w:lvl>
   </w:abstractNum>
-  <w:abstractNum w:abstractNumId="5" w15:restartNumberingAfterBreak="0">
+  <w:abstractNum w:abstractNumId="6" w15:restartNumberingAfterBreak="0">
     <w:nsid w:val="4A1D785C"/>
     <w:multiLevelType w:val="multilevel"/>
     <w:tmpl w:val="645C8DEA"/>
@@ -4003,7 +4410,7 @@
       </w:pPr>
     </w:lvl>
   </w:abstractNum>
-  <w:abstractNum w:abstractNumId="6" w15:restartNumberingAfterBreak="0">
+  <w:abstractNum w:abstractNumId="7" w15:restartNumberingAfterBreak="0">
     <w:nsid w:val="4C663270"/>
     <w:multiLevelType w:val="hybridMultilevel"/>
     <w:tmpl w:val="77706764"/>
@@ -4089,7 +4496,7 @@
       </w:pPr>
     </w:lvl>
   </w:abstractNum>
-  <w:abstractNum w:abstractNumId="7" w15:restartNumberingAfterBreak="0">
+  <w:abstractNum w:abstractNumId="8" w15:restartNumberingAfterBreak="0">
     <w:nsid w:val="61775CD1"/>
     <w:multiLevelType w:val="hybridMultilevel"/>
     <w:tmpl w:val="13F06172"/>
@@ -4202,7 +4609,7 @@
       </w:rPr>
     </w:lvl>
   </w:abstractNum>
-  <w:abstractNum w:abstractNumId="8" w15:restartNumberingAfterBreak="0">
+  <w:abstractNum w:abstractNumId="9" w15:restartNumberingAfterBreak="0">
     <w:nsid w:val="6C401FA0"/>
     <w:multiLevelType w:val="multilevel"/>
     <w:tmpl w:val="0F6E64D8"/>
@@ -4315,7 +4722,7 @@
       </w:rPr>
     </w:lvl>
   </w:abstractNum>
-  <w:abstractNum w:abstractNumId="9" w15:restartNumberingAfterBreak="0">
+  <w:abstractNum w:abstractNumId="10" w15:restartNumberingAfterBreak="0">
     <w:nsid w:val="738A5525"/>
     <w:multiLevelType w:val="multilevel"/>
     <w:tmpl w:val="447A540E"/>
@@ -4432,30 +4839,33 @@
     <w:abstractNumId w:val="0"/>
   </w:num>
   <w:num w:numId="2" w16cid:durableId="511723224">
-    <w:abstractNumId w:val="8"/>
+    <w:abstractNumId w:val="9"/>
   </w:num>
   <w:num w:numId="3" w16cid:durableId="337001736">
     <w:abstractNumId w:val="1"/>
   </w:num>
   <w:num w:numId="4" w16cid:durableId="1043940651">
-    <w:abstractNumId w:val="5"/>
+    <w:abstractNumId w:val="6"/>
   </w:num>
   <w:num w:numId="5" w16cid:durableId="947009850">
     <w:abstractNumId w:val="3"/>
   </w:num>
   <w:num w:numId="6" w16cid:durableId="1440251800">
-    <w:abstractNumId w:val="9"/>
+    <w:abstractNumId w:val="10"/>
   </w:num>
   <w:num w:numId="7" w16cid:durableId="623121947">
-    <w:abstractNumId w:val="6"/>
+    <w:abstractNumId w:val="7"/>
   </w:num>
   <w:num w:numId="8" w16cid:durableId="2780307">
     <w:abstractNumId w:val="2"/>
   </w:num>
   <w:num w:numId="9" w16cid:durableId="431510450">
-    <w:abstractNumId w:val="7"/>
+    <w:abstractNumId w:val="8"/>
   </w:num>
   <w:num w:numId="10" w16cid:durableId="1468931498">
+    <w:abstractNumId w:val="5"/>
+  </w:num>
+  <w:num w:numId="11" w16cid:durableId="817459725">
     <w:abstractNumId w:val="4"/>
   </w:num>
 </w:numbering>
@@ -5484,28 +5894,28 @@
 </file>
 
 <file path=customXml/item1.xml><?xml version="1.0" encoding="utf-8"?>
-<b:Sources xmlns:b="http://schemas.openxmlformats.org/officeDocument/2006/bibliography" xmlns="http://schemas.openxmlformats.org/officeDocument/2006/bibliography" SelectedStyle="\APASixthEditionOfficeOnline.xsl" StyleName="APA" Version="6"/>
-</file>
-
-<file path=customXml/item2.xml><?xml version="1.0" encoding="utf-8"?>
 <go:gDocsCustomXmlDataStorage xmlns:go="http://customooxmlschemas.google.com/" xmlns:r="http://schemas.openxmlformats.org/officeDocument/2006/relationships" uri="GoogleDocsCustomDataVersion2">
   <go:docsCustomData xmlns:go="http://customooxmlschemas.google.com/" roundtripDataSignature="AMtx7mhH+Ly2nTFbP4pXUGnPExrG8/VRag==">CgMxLjA4AHIhMW1WS212SEFTSk90MWxhT0tmekdlcThHRmM2SjhEUkdi</go:docsCustomData>
 </go:gDocsCustomXmlDataStorage>
 </file>
 
-<file path=customXml/itemProps1.xml><?xml version="1.0" encoding="utf-8"?>
-<ds:datastoreItem xmlns:ds="http://schemas.openxmlformats.org/officeDocument/2006/customXml" ds:itemID="{1512C41E-F0FB-4803-96DE-EE8383FCD374}">
-  <ds:schemaRefs>
-    <ds:schemaRef ds:uri="http://schemas.openxmlformats.org/officeDocument/2006/bibliography"/>
-  </ds:schemaRefs>
-</ds:datastoreItem>
+<file path=customXml/item2.xml><?xml version="1.0" encoding="utf-8"?>
+<b:Sources xmlns:b="http://schemas.openxmlformats.org/officeDocument/2006/bibliography" xmlns="http://schemas.openxmlformats.org/officeDocument/2006/bibliography" SelectedStyle="\APASixthEditionOfficeOnline.xsl" StyleName="APA" Version="6"/>
 </file>
 
-<file path=customXml/itemProps2.xml><?xml version="1.0" encoding="utf-8"?>
+<file path=customXml/itemProps1.xml><?xml version="1.0" encoding="utf-8"?>
 <ds:datastoreItem xmlns:ds="http://schemas.openxmlformats.org/officeDocument/2006/customXml" ds:itemID="{11111111-1234-1234-1234-123412341234}">
   <ds:schemaRefs>
     <ds:schemaRef ds:uri="http://customooxmlschemas.google.com/"/>
     <ds:schemaRef ds:uri="http://schemas.openxmlformats.org/officeDocument/2006/relationships"/>
   </ds:schemaRefs>
 </ds:datastoreItem>
+</file>
+
+<file path=customXml/itemProps2.xml><?xml version="1.0" encoding="utf-8"?>
+<ds:datastoreItem xmlns:ds="http://schemas.openxmlformats.org/officeDocument/2006/customXml" ds:itemID="{1512C41E-F0FB-4803-96DE-EE8383FCD374}">
+  <ds:schemaRefs>
+    <ds:schemaRef ds:uri="http://schemas.openxmlformats.org/officeDocument/2006/bibliography"/>
+  </ds:schemaRefs>
+</ds:datastoreItem>
 </file>
</xml_diff>